<commit_message>
docs: add 4 strategic call defense questions to tech stack documentation
</commit_message>
<xml_diff>
--- a/docs/defense/FORDAGO_TECH_STACK_DEFENSE_GUIDE.docx
+++ b/docs/defense/FORDAGO_TECH_STACK_DEFENSE_GUIDE.docx
@@ -29,7 +29,7 @@
           <w:color w:val="D97706"/>
           <w:sz w:val="22"/>
         </w:rPr>
-        <w:t>Mobile-Based Gym Database Management System | Capstone Defense Reference</w:t>
+        <w:t>Mobile-Based Gym Database Management System | Capstone Defense &amp; Interview Reference</w:t>
       </w:r>
     </w:p>
     <w:tbl>
@@ -1015,12 +1015,12 @@
           <w:color w:val="0F172A"/>
           <w:sz w:val="28"/>
         </w:rPr>
-        <w:t>3. Capstone Defense Reviewer (Key Panel Questions &amp; Answers)</w:t>
+        <w:t>3. Strategic Business &amp; Evaluation Reviewer (Core Call Questions)</w:t>
       </w:r>
     </w:p>
     <w:p>
       <w:pPr>
-        <w:spacing w:before="160" w:after="40"/>
+        <w:spacing w:before="200" w:after="40"/>
       </w:pPr>
       <w:r>
         <w:rPr>
@@ -1029,7 +1029,7 @@
           <w:color w:val="0F172A"/>
           <w:sz w:val="21"/>
         </w:rPr>
-        <w:t>Q1: Why did you choose Ionic + Angular with Capacitor instead of pure native Android (Kotlin/Java)?</w:t>
+        <w:t>Question 1: How do you save data and what do you plan to do with that?</w:t>
       </w:r>
     </w:p>
     <w:tbl>
@@ -1069,7 +1069,16 @@
                 <w:color w:val="1E293B"/>
                 <w:sz w:val="19"/>
               </w:rPr>
-              <w:t>Answer: Our primary objective was a Single Codebase, Cross-Platform Architecture. Building natively in Kotlin would restrict the system exclusively to Android and double our development and maintenance overhead. Capacitor provides a direct bridge to native hardware features—specifically Biometrics (Fingerprint) and the physical Camera for QR scanning—delivering native-grade performance while allowing instant deployment across Android, iOS, and Web.</w:t>
+              <w:t>• How Data is Saved: Data is stored in a normalized MySQL relational database managed by Laravel's Eloquent ORM. Sensitive data (passwords) are hashed with adaptive Bcrypt, requests are secured via Sanctum Bearer tokens, and critical financial/attendance transactions use ACID database transactions (DB::transaction).</w:t>
+              <w:br/>
+              <w:br/>
+              <w:t>• What We Plan to Do With the Data:</w:t>
+              <w:br/>
+              <w:t xml:space="preserve">  1. Operational Automation: Real-time QR attendance check-in, tracking daily walk-in payments vs. monthly premium passes, automated membership expiration alerts, and live stock deductions for shop orders.</w:t>
+              <w:br/>
+              <w:t xml:space="preserve">  2. Business Intelligence &amp; Analytics: Aggregating attendance into actionable management insights (peak gym hours, daily/monthly revenue, retention rates) exportable to PDF via jsPDF.</w:t>
+              <w:br/>
+              <w:t xml:space="preserve">  3. Personalized Member Progress: Tracking daily workout streaks and enabling coaches to review attendance history to propose customized workout routines.</w:t>
             </w:r>
           </w:p>
         </w:tc>
@@ -1077,7 +1086,7 @@
     </w:tbl>
     <w:p>
       <w:pPr>
-        <w:spacing w:before="160" w:after="40"/>
+        <w:spacing w:before="200" w:after="40"/>
       </w:pPr>
       <w:r>
         <w:rPr>
@@ -1086,7 +1095,7 @@
           <w:color w:val="0F172A"/>
           <w:sz w:val="21"/>
         </w:rPr>
-        <w:t>Q2: Why did you select Laravel over lightweight alternatives like Node.js / Express?</w:t>
+        <w:t>Question 2: Was this a unique project and what is the use case that you built on?</w:t>
       </w:r>
     </w:p>
     <w:tbl>
@@ -1126,7 +1135,18 @@
                 <w:color w:val="1E293B"/>
                 <w:sz w:val="19"/>
               </w:rPr>
-              <w:t>Answer: While Node.js is minimal, Laravel offers an enterprise-ready ecosystem out of the box with standardized security: Laravel Sanctum provides battle-tested API token authorization, Eloquent ORM prevents SQL injection via parameterized queries, and Laravel Reverb provides an integrated WebSocket server. This ensures robust architectural discipline, structured migrations, and reduced dependency on fragmented third-party libraries.</w:t>
+              <w:t>• The Core Use Case: FordaGo is built specifically for local community fitness centers (AffordaGym – San Isidro Branch) to eliminate paper logbooks, lost physical membership cards, unverified daily pass payments, and fragmented communication between members and fitness coaches.</w:t>
+              <w:br/>
+              <w:br/>
+              <w:t>• What Makes It Unique (Novelty &amp; Value Proposition):</w:t>
+              <w:br/>
+              <w:t xml:space="preserve">  1. All-in-One Community Gym Ecosystem: Unlike generic workout trackers (which only count reps) or basic POS systems, FordaGo unifies hardware access, equipment guidance, coaching consultations, and inventory commerce in one mobile app.</w:t>
+              <w:br/>
+              <w:t xml:space="preserve">  2. Dual-Function QR Architecture: Front-desk QR for contactless attendance/payment verification, and Machine QR tags that instantly open video/step-by-step workout guides and targeted muscle diagrams.</w:t>
+              <w:br/>
+              <w:t xml:space="preserve">  3. Hardware Biometric Authentication: Native fingerprint login via Capacitor Biometric Auth.</w:t>
+              <w:br/>
+              <w:t xml:space="preserve">  4. Direct Coach-Client Interactive Hub: In-app workout plan proposals and real-time consultation chat.</w:t>
             </w:r>
           </w:p>
         </w:tc>
@@ -1134,7 +1154,7 @@
     </w:tbl>
     <w:p>
       <w:pPr>
-        <w:spacing w:before="160" w:after="40"/>
+        <w:spacing w:before="200" w:after="40"/>
       </w:pPr>
       <w:r>
         <w:rPr>
@@ -1143,7 +1163,7 @@
           <w:color w:val="0F172A"/>
           <w:sz w:val="21"/>
         </w:rPr>
-        <w:t>Q3: How does the system achieve real-time synchronization?</w:t>
+        <w:t>Question 3: Did you think about the marketing side?</w:t>
       </w:r>
     </w:p>
     <w:tbl>
@@ -1183,7 +1203,15 @@
                 <w:color w:val="1E293B"/>
                 <w:sz w:val="19"/>
               </w:rPr>
-              <w:t>Answer: Instead of using client polling (which repeatedly requests the server every few seconds and drains mobile battery), FordaGo employs WebSockets via Laravel Reverb and Laravel Echo. When an attendance QR is scanned or an admin broadcasts an announcement, the server pushes the event payload over active WebSocket channels in under 100 milliseconds, immediately updating client interfaces without a manual page refresh.</w:t>
+              <w:t>• Yes, Built-in Growth &amp; Retention Strategy:</w:t>
+              <w:br/>
+              <w:t xml:space="preserve">  1. Gamification &amp; Member Retention: Visual daily streak counters and milestone badges keep members motivated and actively visiting the gym, preventing membership churn.</w:t>
+              <w:br/>
+              <w:t xml:space="preserve">  2. Direct Mobile Marketing &amp; Announcements: Gym administrators can broadcast gym-wide announcements (e.g., promo rates, supplement discounts, holiday schedules, fitness challenges) directly to every registered member's device.</w:t>
+              <w:br/>
+              <w:t xml:space="preserve">  3. Daily-to-Premium Conversion Funnel: Walk-in members using the Daily Pass are presented with transparent pricing and instant upgrade paths to monthly Premium Pass, boosting recurring gym revenue.</w:t>
+              <w:br/>
+              <w:t xml:space="preserve">  4. Off-Peak Dynamic Promotion: Peak hour analytics help gym management introduce off-peak discounts or happy-hour membership promos to optimize gym floor utilization.</w:t>
             </w:r>
           </w:p>
         </w:tc>
@@ -1191,7 +1219,7 @@
     </w:tbl>
     <w:p>
       <w:pPr>
-        <w:spacing w:before="160" w:after="40"/>
+        <w:spacing w:before="200" w:after="40"/>
       </w:pPr>
       <w:r>
         <w:rPr>
@@ -1200,7 +1228,7 @@
           <w:color w:val="0F172A"/>
           <w:sz w:val="21"/>
         </w:rPr>
-        <w:t>Q4: How does FordaGo protect member data and prevent unauthorized access?</w:t>
+        <w:t>Question 4: Does this all have basic features like push notifications and how do you manage it?</w:t>
       </w:r>
     </w:p>
     <w:tbl>
@@ -1240,15 +1268,20 @@
                 <w:color w:val="1E293B"/>
                 <w:sz w:val="19"/>
               </w:rPr>
-              <w:t>Answer: Security is enforced in four tiers:</w:t>
+              <w:t>• Yes, Comprehensive Notification System:</w:t>
               <w:br/>
-              <w:t>1. Network Security: HTTPS API endpoints and WSS encrypted sockets.</w:t>
+              <w:t xml:space="preserve">  • Technology Engine: Integrated using Firebase Cloud Messaging (FCM), Capacitor Local Notifications, and Laravel Reverb WebSockets for instant real-time delivery.</w:t>
               <w:br/>
-              <w:t>2. Cryptographic Auth: Sanctum Bearer tokens and Bcrypt password hashing.</w:t>
               <w:br/>
-              <w:t>3. Hardware Biometrics: Biometric authentication is delegated to Android's secure enclave (BiometricPrompt); biometric templates never leave the user's device.</w:t>
+              <w:t xml:space="preserve">  • How It Is Managed (Admin Notification Center):</w:t>
               <w:br/>
-              <w:t>4. Auditability: All critical mutations (deletions, member role updates, payment approvals) are permanently captured in the activity_logs table with actor ID, IP address, and timestamp.</w:t>
+              <w:t xml:space="preserve">    1. Broadcast Announcements: Single-click popup modal dispatch to send announcements to all registered gym members at once.</w:t>
+              <w:br/>
+              <w:t xml:space="preserve">    2. Targeted Direct Notices: Admins can search and select an individual member to send private notices (e.g., payment verification, pass expiration, shop order pickup readiness).</w:t>
+              <w:br/>
+              <w:t xml:space="preserve">    3. Automated Event Triggers: The system auto-notifies members when their pass is expiring, when a coach assigns a workout plan, or when an order status changes.</w:t>
+              <w:br/>
+              <w:t xml:space="preserve">    4. Notification Hub: Dedicated admin interface with unread badges, filter by member account, live search, mark all as read, and single-click deletion.</w:t>
             </w:r>
           </w:p>
         </w:tc>

</xml_diff>